<commit_message>
Publicação: artigo (HTML, PDF de journal, .docx), suplemento, resumo em linguagem simples e vitrine interativa em docs/
- docs/ gerado por ferramentas/publicar.sh, com todas as travas, verificar_pdf.py, sanitização, textos, links,
  licenças e QA da vitrine (Playwright e axe: 4 larguras, 2 temas, zero erros e zero requisições externas)
- docs/publicar.sh removido (o script foi para ferramentas/)
- tabelas do artigo em HTML alinhadas à esquerda

Co-Authored-By: Claude Opus 5.5 <noreply@anthropic.com>
</commit_message>
<xml_diff>
--- a/docs/relatorio-tecnico.docx
+++ b/docs/relatorio-tecnico.docx
@@ -362,7 +362,7 @@
         <w:t xml:space="preserve">bandwagon</w:t>
       </w:r>
       <w:r>
-        <w:t xml:space="preserve">, mas a certeza é muito baixa em todas as células de apoio ao líder, a certeza qualifica a direção e não a magnitude, e nenhum estudo trata de pesquisas no Brasil.</w:t>
+        <w:t xml:space="preserve">, mas a certeza é muito baixa em todas as células de apoio ao líder, a certeza qualifica a direção e não a magnitude, e nenhum estudo estima o efeito de pesquisas publicadas no Brasil (o único que inclui o país, um corte transversal de 46 países, ficou fora da contagem).</w:t>
       </w:r>
     </w:p>
     <w:p>
@@ -452,7 +452,7 @@
         <w:t xml:space="preserve">Hardmeier (2008)</w:t>
       </w:r>
       <w:r>
-        <w:t xml:space="preserve">, uma síntese com meta-análise cujo último ano de busca não foi verificado (capítulo sem texto aberto).</w:t>
+        <w:t xml:space="preserve">, capítulo de síntese sem texto aberto, cujo conteúdo e período não foram verificados.</w:t>
       </w:r>
       <w:r>
         <w:t xml:space="preserve"> </w:t>
@@ -980,7 +980,20 @@
         <w:t xml:space="preserve">revisor_humano_1</w:t>
       </w:r>
       <w:r>
-        <w:t xml:space="preserve">, aprovou G1 e G2, decidiu a Emenda 1, as 17 decisões de casos limítrofes de texto completo, as convenções da Emenda 4 (itens 4a a 4c, por questionário) e a Emenda 6b, e escolheu por custo o árbitro do risco de viés (Emenda 3). Em 23/09/2026, o revisor declarou que não conferiu outras decisões que o log registrava como suas; a correção está na Emenda 6a e é detalhada em Limitações do processo.</w:t>
+        <w:t xml:space="preserve">, aprovou G1 e G2, decidiu a Emenda 1, as 16 decisões de casos limítrofes de texto completo (17 registros no</w:t>
+      </w:r>
+      <w:r>
+        <w:t xml:space="preserve"> </w:t>
+      </w:r>
+      <w:r>
+        <w:rPr>
+          <w:i/>
+          <w:iCs/>
+        </w:rPr>
+        <w:t xml:space="preserve">log</w:t>
+      </w:r>
+      <w:r>
+        <w:t xml:space="preserve">, um deles de teste), as convenções da Emenda 4 (itens 4a a 4c, por questionário) e a Emenda 6b, e escolheu por custo o árbitro do risco de viés (Emenda 3). Em 23/09/2026, o revisor declarou que não conferiu outras decisões que o log registrava como suas; a correção está na Emenda 6a e é detalhada em Limitações do processo.</w:t>
       </w:r>
     </w:p>
     <w:bookmarkStart w:id="17" w:name="critérios-de-elegibilidade-5"/>
@@ -1926,7 +1939,20 @@
         <w:t xml:space="preserve"> </w:t>
       </w:r>
       <w:r>
-        <w:t xml:space="preserve">(17 decisões, Emenda 6a); em 3 casos, a IA estendeu a caso novo uma regra que o revisor tinha decidido para outro grupo, sem conferência humana. As 165 decisões propostas a partir das fichas (47 de inclusão e 118 de exclusão) aguardam conferência humana (P041). Relatos do mesmo estudo foram ligados antes da extração, e as retratações foram checadas no OpenAlex e na Crossref (nenhuma entre os 55 relatos incluídos).</w:t>
+        <w:t xml:space="preserve">(16 decisões, mais 1 registro de teste no</w:t>
+      </w:r>
+      <w:r>
+        <w:t xml:space="preserve"> </w:t>
+      </w:r>
+      <w:r>
+        <w:rPr>
+          <w:i/>
+          <w:iCs/>
+        </w:rPr>
+        <w:t xml:space="preserve">log</w:t>
+      </w:r>
+      <w:r>
+        <w:t xml:space="preserve">; Emenda 6a); em 3 casos, a IA estendeu a caso novo uma regra que o revisor tinha decidido para outro grupo, sem conferência humana. As 165 decisões propostas a partir das fichas (47 de inclusão e 118 de exclusão) aguardam conferência humana (P041). Relatos do mesmo estudo foram ligados antes da extração, e as retratações foram checadas no OpenAlex e na Crossref (nenhuma entre os 55 relatos incluídos).</w:t>
       </w:r>
     </w:p>
     <w:p>
@@ -24612,7 +24638,7 @@
                     <w:jc w:val="center"/>
                   </w:pPr>
                   <w:r>
-                    <w:t xml:space="preserve">0,00 (0,00 a 0,97)</w:t>
+                    <w:t xml:space="preserve">0,00 (0,00 a 0,98)</w:t>
                   </w:r>
                 </w:p>
               </w:tc>
@@ -24992,7 +25018,7 @@
                     <w:jc w:val="center"/>
                   </w:pPr>
                   <w:r>
-                    <w:t xml:space="preserve">0,00 (0,00 a 0,97)</w:t>
+                    <w:t xml:space="preserve">0,00 (0,00 a 0,98)</w:t>
                   </w:r>
                 </w:p>
               </w:tc>
@@ -25102,7 +25128,7 @@
                     <w:jc w:val="center"/>
                   </w:pPr>
                   <w:r>
-                    <w:t xml:space="preserve">0,00 (0,00 a 0,97)</w:t>
+                    <w:t xml:space="preserve">0,00 (0,00 a 0,98)</w:t>
                   </w:r>
                 </w:p>
               </w:tc>
@@ -26208,7 +26234,7 @@
         <w:t xml:space="preserve"> </w:t>
       </w:r>
       <w:r>
-        <w:t xml:space="preserve">ficou misto (um efeito negativo e outro positivo, abaixo do limiar de 70%). A proporção foi 0,00 (IC 95% 0,00 a 0,97; p = 1). Em</w:t>
+        <w:t xml:space="preserve">ficou misto (um efeito negativo e outro positivo, abaixo do limiar de 70%). A proporção foi 0,00 (IC 95% 0,00 a 0,98; p = 1). Em</w:t>
       </w:r>
       <w:r>
         <w:t xml:space="preserve"> </w:t>
@@ -32301,7 +32327,7 @@
                     <w:jc w:val="center"/>
                   </w:pPr>
                   <w:r>
-                    <w:t xml:space="preserve">0,00 (0,00 a 0,97)</w:t>
+                    <w:t xml:space="preserve">0,00 (0,00 a 0,98)</w:t>
                   </w:r>
                 </w:p>
               </w:tc>
@@ -37948,7 +37974,7 @@
                     <w:jc w:val="center"/>
                   </w:pPr>
                   <w:r>
-                    <w:t xml:space="preserve">0 mobilização; 1 desmobilização (0,00; 0,00 a 0,97)</w:t>
+                    <w:t xml:space="preserve">0 mobilização; 1 desmobilização (0,00; 0,00 a 0,98)</w:t>
                   </w:r>
                 </w:p>
               </w:tc>
@@ -38137,7 +38163,7 @@
                     <w:jc w:val="center"/>
                   </w:pPr>
                   <w:r>
-                    <w:t xml:space="preserve">0 mobilização; 1 desmobilização; 1 misto (0,00; 0,00 a 0,97)</w:t>
+                    <w:t xml:space="preserve">0 mobilização; 1 desmobilização; 1 misto (0,00; 0,00 a 0,98)</w:t>
                   </w:r>
                 </w:p>
               </w:tc>
@@ -38205,7 +38231,7 @@
                     <w:jc w:val="center"/>
                   </w:pPr>
                   <w:r>
-                    <w:t xml:space="preserve">0 mobilização; 1 desmobilização (0,00; 0,00 a 0,97)</w:t>
+                    <w:t xml:space="preserve">0 mobilização; 1 desmobilização (0,00; 0,00 a 0,98)</w:t>
                   </w:r>
                 </w:p>
               </w:tc>
@@ -39213,7 +39239,7 @@
         <w:t xml:space="preserve"> </w:t>
       </w:r>
       <w:r>
-        <w:t xml:space="preserve">fez uma meta-análise cujos números e período não foram verificados nesta revisão (capítulo sem texto aberto);</w:t>
+        <w:t xml:space="preserve">é um capítulo de síntese cujo conteúdo não foi verificado (sem texto aberto);</w:t>
       </w:r>
       <w:r>
         <w:t xml:space="preserve"> </w:t>
@@ -39319,7 +39345,7 @@
         <w:t xml:space="preserve"> </w:t>
       </w:r>
       <w:r>
-        <w:t xml:space="preserve">Os IC 95% das proporções de direção são largos em todas as células; nas células de 1 estudo, vão de 0,03 a 1,00 ou de 0,00 a 0,97.</w:t>
+        <w:t xml:space="preserve">Os IC 95% das proporções de direção são largos em todas as células; nas células de 1 estudo, vão de 0,03 a 1,00 ou de 0,00 a 0,98.</w:t>
       </w:r>
     </w:p>
     <w:p>
@@ -40285,7 +40311,16 @@
         <w:pStyle w:val="FirstParagraph"/>
       </w:pPr>
       <w:r>
-        <w:t xml:space="preserve">Para o debate sobre proibir ou restringir a divulgação de pesquisas, a evidência reunida é insuficiente para sustentar que a divulgação muda o voto numa direção e magnitude conhecidas. É muito incerto se a exposição a pesquisas aumenta o apoio ao líder nas células do protocolo, e é muito incerto se a divulgação de boca de urna reduz o comparecimento. Nenhum estudo avalia pesquisas publicadas no Brasil. Qualquer argumento regulatório baseado nesta revisão deve dizer que a certeza é muito baixa ou baixa na maior parte das células e que não há evidência brasileira sobre pesquisas.</w:t>
+        <w:t xml:space="preserve">Para o debate sobre proibir ou restringir a divulgação de pesquisas, a evidência reunida é insuficiente para sustentar que a divulgação muda o voto numa direção e magnitude conhecidas. É muito incerto se a exposição a pesquisas aumenta o apoio ao líder nas células do protocolo, e é muito incerto se a divulgação de boca de urna reduz o comparecimento. Nenhum estudo estima o efeito de pesquisas publicadas no Brasil; o único que inclui o país, entre 46, é um corte transversal que ficou fora da contagem</w:t>
+      </w:r>
+      <w:r>
+        <w:t xml:space="preserve"> </w:t>
+      </w:r>
+      <w:r>
+        <w:t xml:space="preserve">(Lago et al. 2015)</w:t>
+      </w:r>
+      <w:r>
+        <w:t xml:space="preserve">. Qualquer argumento regulatório baseado nesta revisão deve dizer que a certeza é muito baixa ou baixa na maior parte das células e que não há evidência brasileira sobre pesquisas.</w:t>
       </w:r>
     </w:p>
     <w:p>
@@ -40773,7 +40808,7 @@
         <w:t xml:space="preserve">claude-opus-5-5</w:t>
       </w:r>
       <w:r>
-        <w:t xml:space="preserve">. A IA decidiu a triagem de títulos e resumos pela regra liberal e a triagem complementar dos 336 registros sem resumo, e propôs, sem validação humana, a elegibilidade, a extração, as correções dos efeitos, o risco de viés e a certeza. O coordenador de IA executou os scripts e aplicou as correções, e um subagente de IA redigiu este rascunho a partir dos arquivos do projeto. O revisor humano aprovou o protocolo, decidiu as emendas de escopo e 17 casos limítrofes de elegibilidade; decisões que o log atribuía a ele sem que as tivesse conferido foram corrigidas pela Emenda 6a. Não houve validação humana da triagem: o recall não foi calculado, e as amostras de validação (141 registros) e de elusão (300 registros) seguem sem codificação. A concordância entre os triadores de IA na primeira onda foi 0,97 (κ 0,90) e a da recodificação cega da extração foi 58,5% (560 comparações), medidas de consistência entre agentes e não de acurácia. Limitações: todos os modelos são do mesmo provedor, o árbitro do risco de viés é o mesmo modelo do avaliador A, as versões dos modelos podem mudar, e 18 pendências de validação humana estão abertas. O texto completo da declaração está em</w:t>
+        <w:t xml:space="preserve">. A IA decidiu a triagem de títulos e resumos pela regra liberal e a triagem complementar dos 336 registros sem resumo, e propôs, sem validação humana, a elegibilidade, a extração, as correções dos efeitos, o risco de viés e a certeza. O coordenador de IA executou os scripts e aplicou as correções, e um subagente de IA redigiu este rascunho a partir dos arquivos do projeto. O revisor humano aprovou o protocolo, decidiu as emendas de escopo e 16 casos limítrofes de elegibilidade; decisões que o log atribuía a ele sem que as tivesse conferido foram corrigidas pela Emenda 6a. Não houve validação humana da triagem: o recall não foi calculado, e as amostras de validação (141 registros) e de elusão (300 registros) seguem sem codificação. A concordância entre os triadores de IA na primeira onda foi 0,97 (κ 0,90) e a da recodificação cega da extração foi 58,5% (560 comparações), medidas de consistência entre agentes e não de acurácia. Limitações: todos os modelos são do mesmo provedor, o árbitro do risco de viés é o mesmo modelo do avaliador A, as versões dos modelos podem mudar, e 18 pendências de validação humana estão abertas. O texto completo da declaração está em</w:t>
       </w:r>
       <w:r>
         <w:t xml:space="preserve"> </w:t>

</xml_diff>